<commit_message>
fix(generador fase 2): lista de cotejo elimina filas de recaudos no exigidos
</commit_message>
<xml_diff>
--- a/src/generador-documentos/templates/lista-cotejo-template.docx
+++ b/src/generador-documentos/templates/lista-cotejo-template.docx
@@ -531,67 +531,70 @@
                 <w:szCs w:val="20"/>
                 <w:rtl w:val="0"/>
               </w:rPr>
+              <w:t xml:space="preserve"/>
+            </w:r>
+          </w:p>
+        </w:tc>
+        <w:tc>
+          <w:tcPr/>
+          <w:p>
+            <w:pPr>
+              <w:widowControl w:val="0"/>
+              <w:jc w:val="both"/>
+              <w:rPr>
+                <w:b w:val="1"/>
+                <w:bCs w:val="1"/>
+                <w:sz w:val="20"/>
+                <w:szCs w:val="20"/>
+              </w:rPr>
+            </w:pPr>
+            <w:r>
+              <w:rPr>
+                <w:rtl w:val="0"/>
+              </w:rPr>
+            </w:r>
+          </w:p>
+        </w:tc>
+        <w:tc>
+          <w:tcPr/>
+          <w:p>
+            <w:pPr>
+              <w:widowControl w:val="0"/>
+              <w:jc w:val="both"/>
+              <w:rPr>
+                <w:b w:val="1"/>
+                <w:bCs w:val="1"/>
+                <w:sz w:val="20"/>
+                <w:szCs w:val="20"/>
+              </w:rPr>
+            </w:pPr>
+            <w:r>
+              <w:rPr>
+                <w:rtl w:val="0"/>
+              </w:rPr>
+            </w:r>
+          </w:p>
+        </w:tc>
+        <w:tc>
+          <w:tcPr/>
+          <w:p>
+            <w:pPr>
+              <w:widowControl w:val="0"/>
+              <w:jc w:val="both"/>
+              <w:rPr>
+                <w:b w:val="1"/>
+                <w:bCs w:val="1"/>
+                <w:sz w:val="20"/>
+                <w:szCs w:val="20"/>
+              </w:rPr>
+            </w:pPr>
+            <w:r>
+              <w:rPr>
+                <w:rtl w:val="0"/>
+              </w:rPr>
+            </w:r>
+            <w:r>
               <w:t xml:space="preserve">{/mod_carta_manifestacion_voluntad_au_au}</w:t>
-            </w:r>
-          </w:p>
-        </w:tc>
-        <w:tc>
-          <w:tcPr/>
-          <w:p>
-            <w:pPr>
-              <w:widowControl w:val="0"/>
-              <w:jc w:val="both"/>
-              <w:rPr>
-                <w:b w:val="1"/>
-                <w:bCs w:val="1"/>
-                <w:sz w:val="20"/>
-                <w:szCs w:val="20"/>
-              </w:rPr>
-            </w:pPr>
-            <w:r>
-              <w:rPr>
-                <w:rtl w:val="0"/>
-              </w:rPr>
-            </w:r>
-          </w:p>
-        </w:tc>
-        <w:tc>
-          <w:tcPr/>
-          <w:p>
-            <w:pPr>
-              <w:widowControl w:val="0"/>
-              <w:jc w:val="both"/>
-              <w:rPr>
-                <w:b w:val="1"/>
-                <w:bCs w:val="1"/>
-                <w:sz w:val="20"/>
-                <w:szCs w:val="20"/>
-              </w:rPr>
-            </w:pPr>
-            <w:r>
-              <w:rPr>
-                <w:rtl w:val="0"/>
-              </w:rPr>
-            </w:r>
-          </w:p>
-        </w:tc>
-        <w:tc>
-          <w:tcPr/>
-          <w:p>
-            <w:pPr>
-              <w:widowControl w:val="0"/>
-              <w:jc w:val="both"/>
-              <w:rPr>
-                <w:b w:val="1"/>
-                <w:bCs w:val="1"/>
-                <w:sz w:val="20"/>
-                <w:szCs w:val="20"/>
-              </w:rPr>
-            </w:pPr>
-            <w:r>
-              <w:rPr>
-                <w:rtl w:val="0"/>
-              </w:rPr>
             </w:r>
           </w:p>
         </w:tc>
@@ -636,67 +639,70 @@
                 <w:szCs w:val="20"/>
                 <w:rtl w:val="0"/>
               </w:rPr>
+              <w:t xml:space="preserve"/>
+            </w:r>
+          </w:p>
+        </w:tc>
+        <w:tc>
+          <w:tcPr/>
+          <w:p>
+            <w:pPr>
+              <w:widowControl w:val="0"/>
+              <w:jc w:val="both"/>
+              <w:rPr>
+                <w:b w:val="1"/>
+                <w:bCs w:val="1"/>
+                <w:sz w:val="20"/>
+                <w:szCs w:val="20"/>
+              </w:rPr>
+            </w:pPr>
+            <w:r>
+              <w:rPr>
+                <w:rtl w:val="0"/>
+              </w:rPr>
+            </w:r>
+          </w:p>
+        </w:tc>
+        <w:tc>
+          <w:tcPr/>
+          <w:p>
+            <w:pPr>
+              <w:widowControl w:val="0"/>
+              <w:jc w:val="both"/>
+              <w:rPr>
+                <w:b w:val="1"/>
+                <w:bCs w:val="1"/>
+                <w:sz w:val="20"/>
+                <w:szCs w:val="20"/>
+              </w:rPr>
+            </w:pPr>
+            <w:r>
+              <w:rPr>
+                <w:rtl w:val="0"/>
+              </w:rPr>
+            </w:r>
+          </w:p>
+        </w:tc>
+        <w:tc>
+          <w:tcPr/>
+          <w:p>
+            <w:pPr>
+              <w:widowControl w:val="0"/>
+              <w:jc w:val="both"/>
+              <w:rPr>
+                <w:b w:val="1"/>
+                <w:bCs w:val="1"/>
+                <w:sz w:val="20"/>
+                <w:szCs w:val="20"/>
+              </w:rPr>
+            </w:pPr>
+            <w:r>
+              <w:rPr>
+                <w:rtl w:val="0"/>
+              </w:rPr>
+            </w:r>
+            <w:r>
               <w:t xml:space="preserve">{/mod_carta_autorizacion_au_au}</w:t>
-            </w:r>
-          </w:p>
-        </w:tc>
-        <w:tc>
-          <w:tcPr/>
-          <w:p>
-            <w:pPr>
-              <w:widowControl w:val="0"/>
-              <w:jc w:val="both"/>
-              <w:rPr>
-                <w:b w:val="1"/>
-                <w:bCs w:val="1"/>
-                <w:sz w:val="20"/>
-                <w:szCs w:val="20"/>
-              </w:rPr>
-            </w:pPr>
-            <w:r>
-              <w:rPr>
-                <w:rtl w:val="0"/>
-              </w:rPr>
-            </w:r>
-          </w:p>
-        </w:tc>
-        <w:tc>
-          <w:tcPr/>
-          <w:p>
-            <w:pPr>
-              <w:widowControl w:val="0"/>
-              <w:jc w:val="both"/>
-              <w:rPr>
-                <w:b w:val="1"/>
-                <w:bCs w:val="1"/>
-                <w:sz w:val="20"/>
-                <w:szCs w:val="20"/>
-              </w:rPr>
-            </w:pPr>
-            <w:r>
-              <w:rPr>
-                <w:rtl w:val="0"/>
-              </w:rPr>
-            </w:r>
-          </w:p>
-        </w:tc>
-        <w:tc>
-          <w:tcPr/>
-          <w:p>
-            <w:pPr>
-              <w:widowControl w:val="0"/>
-              <w:jc w:val="both"/>
-              <w:rPr>
-                <w:b w:val="1"/>
-                <w:bCs w:val="1"/>
-                <w:sz w:val="20"/>
-                <w:szCs w:val="20"/>
-              </w:rPr>
-            </w:pPr>
-            <w:r>
-              <w:rPr>
-                <w:rtl w:val="0"/>
-              </w:rPr>
             </w:r>
           </w:p>
         </w:tc>
@@ -753,67 +759,70 @@
                 <w:szCs w:val="20"/>
                 <w:rtl w:val="0"/>
               </w:rPr>
+              <w:t xml:space="preserve"/>
+            </w:r>
+          </w:p>
+        </w:tc>
+        <w:tc>
+          <w:tcPr/>
+          <w:p>
+            <w:pPr>
+              <w:widowControl w:val="0"/>
+              <w:jc w:val="both"/>
+              <w:rPr>
+                <w:b w:val="1"/>
+                <w:bCs w:val="1"/>
+                <w:sz w:val="20"/>
+                <w:szCs w:val="20"/>
+              </w:rPr>
+            </w:pPr>
+            <w:r>
+              <w:rPr>
+                <w:rtl w:val="0"/>
+              </w:rPr>
+            </w:r>
+          </w:p>
+        </w:tc>
+        <w:tc>
+          <w:tcPr/>
+          <w:p>
+            <w:pPr>
+              <w:widowControl w:val="0"/>
+              <w:jc w:val="both"/>
+              <w:rPr>
+                <w:b w:val="1"/>
+                <w:bCs w:val="1"/>
+                <w:sz w:val="20"/>
+                <w:szCs w:val="20"/>
+              </w:rPr>
+            </w:pPr>
+            <w:r>
+              <w:rPr>
+                <w:rtl w:val="0"/>
+              </w:rPr>
+            </w:r>
+          </w:p>
+        </w:tc>
+        <w:tc>
+          <w:tcPr/>
+          <w:p>
+            <w:pPr>
+              <w:widowControl w:val="0"/>
+              <w:jc w:val="both"/>
+              <w:rPr>
+                <w:b w:val="1"/>
+                <w:bCs w:val="1"/>
+                <w:sz w:val="20"/>
+                <w:szCs w:val="20"/>
+              </w:rPr>
+            </w:pPr>
+            <w:r>
+              <w:rPr>
+                <w:rtl w:val="0"/>
+              </w:rPr>
+            </w:r>
+            <w:r>
               <w:t xml:space="preserve">{/mod_doc_constitutivo_au_au}</w:t>
-            </w:r>
-          </w:p>
-        </w:tc>
-        <w:tc>
-          <w:tcPr/>
-          <w:p>
-            <w:pPr>
-              <w:widowControl w:val="0"/>
-              <w:jc w:val="both"/>
-              <w:rPr>
-                <w:b w:val="1"/>
-                <w:bCs w:val="1"/>
-                <w:sz w:val="20"/>
-                <w:szCs w:val="20"/>
-              </w:rPr>
-            </w:pPr>
-            <w:r>
-              <w:rPr>
-                <w:rtl w:val="0"/>
-              </w:rPr>
-            </w:r>
-          </w:p>
-        </w:tc>
-        <w:tc>
-          <w:tcPr/>
-          <w:p>
-            <w:pPr>
-              <w:widowControl w:val="0"/>
-              <w:jc w:val="both"/>
-              <w:rPr>
-                <w:b w:val="1"/>
-                <w:bCs w:val="1"/>
-                <w:sz w:val="20"/>
-                <w:szCs w:val="20"/>
-              </w:rPr>
-            </w:pPr>
-            <w:r>
-              <w:rPr>
-                <w:rtl w:val="0"/>
-              </w:rPr>
-            </w:r>
-          </w:p>
-        </w:tc>
-        <w:tc>
-          <w:tcPr/>
-          <w:p>
-            <w:pPr>
-              <w:widowControl w:val="0"/>
-              <w:jc w:val="both"/>
-              <w:rPr>
-                <w:b w:val="1"/>
-                <w:bCs w:val="1"/>
-                <w:sz w:val="20"/>
-                <w:szCs w:val="20"/>
-              </w:rPr>
-            </w:pPr>
-            <w:r>
-              <w:rPr>
-                <w:rtl w:val="0"/>
-              </w:rPr>
             </w:r>
           </w:p>
         </w:tc>
@@ -858,67 +867,70 @@
                 <w:szCs w:val="20"/>
                 <w:rtl w:val="0"/>
               </w:rPr>
+              <w:t xml:space="preserve"/>
+            </w:r>
+          </w:p>
+        </w:tc>
+        <w:tc>
+          <w:tcPr/>
+          <w:p>
+            <w:pPr>
+              <w:widowControl w:val="0"/>
+              <w:jc w:val="both"/>
+              <w:rPr>
+                <w:b w:val="1"/>
+                <w:bCs w:val="1"/>
+                <w:sz w:val="20"/>
+                <w:szCs w:val="20"/>
+              </w:rPr>
+            </w:pPr>
+            <w:r>
+              <w:rPr>
+                <w:rtl w:val="0"/>
+              </w:rPr>
+            </w:r>
+          </w:p>
+        </w:tc>
+        <w:tc>
+          <w:tcPr/>
+          <w:p>
+            <w:pPr>
+              <w:widowControl w:val="0"/>
+              <w:jc w:val="both"/>
+              <w:rPr>
+                <w:b w:val="1"/>
+                <w:bCs w:val="1"/>
+                <w:sz w:val="20"/>
+                <w:szCs w:val="20"/>
+              </w:rPr>
+            </w:pPr>
+            <w:r>
+              <w:rPr>
+                <w:rtl w:val="0"/>
+              </w:rPr>
+            </w:r>
+          </w:p>
+        </w:tc>
+        <w:tc>
+          <w:tcPr/>
+          <w:p>
+            <w:pPr>
+              <w:widowControl w:val="0"/>
+              <w:jc w:val="both"/>
+              <w:rPr>
+                <w:b w:val="1"/>
+                <w:bCs w:val="1"/>
+                <w:sz w:val="20"/>
+                <w:szCs w:val="20"/>
+              </w:rPr>
+            </w:pPr>
+            <w:r>
+              <w:rPr>
+                <w:rtl w:val="0"/>
+              </w:rPr>
+            </w:r>
+            <w:r>
               <w:t xml:space="preserve">{/mod_copia_rif_vigente_au_au}</w:t>
-            </w:r>
-          </w:p>
-        </w:tc>
-        <w:tc>
-          <w:tcPr/>
-          <w:p>
-            <w:pPr>
-              <w:widowControl w:val="0"/>
-              <w:jc w:val="both"/>
-              <w:rPr>
-                <w:b w:val="1"/>
-                <w:bCs w:val="1"/>
-                <w:sz w:val="20"/>
-                <w:szCs w:val="20"/>
-              </w:rPr>
-            </w:pPr>
-            <w:r>
-              <w:rPr>
-                <w:rtl w:val="0"/>
-              </w:rPr>
-            </w:r>
-          </w:p>
-        </w:tc>
-        <w:tc>
-          <w:tcPr/>
-          <w:p>
-            <w:pPr>
-              <w:widowControl w:val="0"/>
-              <w:jc w:val="both"/>
-              <w:rPr>
-                <w:b w:val="1"/>
-                <w:bCs w:val="1"/>
-                <w:sz w:val="20"/>
-                <w:szCs w:val="20"/>
-              </w:rPr>
-            </w:pPr>
-            <w:r>
-              <w:rPr>
-                <w:rtl w:val="0"/>
-              </w:rPr>
-            </w:r>
-          </w:p>
-        </w:tc>
-        <w:tc>
-          <w:tcPr/>
-          <w:p>
-            <w:pPr>
-              <w:widowControl w:val="0"/>
-              <w:jc w:val="both"/>
-              <w:rPr>
-                <w:b w:val="1"/>
-                <w:bCs w:val="1"/>
-                <w:sz w:val="20"/>
-                <w:szCs w:val="20"/>
-              </w:rPr>
-            </w:pPr>
-            <w:r>
-              <w:rPr>
-                <w:rtl w:val="0"/>
-              </w:rPr>
             </w:r>
           </w:p>
         </w:tc>
@@ -963,67 +975,70 @@
                 <w:szCs w:val="20"/>
                 <w:rtl w:val="0"/>
               </w:rPr>
+              <w:t xml:space="preserve"/>
+            </w:r>
+          </w:p>
+        </w:tc>
+        <w:tc>
+          <w:tcPr/>
+          <w:p>
+            <w:pPr>
+              <w:widowControl w:val="0"/>
+              <w:jc w:val="both"/>
+              <w:rPr>
+                <w:b w:val="1"/>
+                <w:bCs w:val="1"/>
+                <w:sz w:val="20"/>
+                <w:szCs w:val="20"/>
+              </w:rPr>
+            </w:pPr>
+            <w:r>
+              <w:rPr>
+                <w:rtl w:val="0"/>
+              </w:rPr>
+            </w:r>
+          </w:p>
+        </w:tc>
+        <w:tc>
+          <w:tcPr/>
+          <w:p>
+            <w:pPr>
+              <w:widowControl w:val="0"/>
+              <w:jc w:val="both"/>
+              <w:rPr>
+                <w:b w:val="1"/>
+                <w:bCs w:val="1"/>
+                <w:sz w:val="20"/>
+                <w:szCs w:val="20"/>
+              </w:rPr>
+            </w:pPr>
+            <w:r>
+              <w:rPr>
+                <w:rtl w:val="0"/>
+              </w:rPr>
+            </w:r>
+          </w:p>
+        </w:tc>
+        <w:tc>
+          <w:tcPr/>
+          <w:p>
+            <w:pPr>
+              <w:widowControl w:val="0"/>
+              <w:jc w:val="both"/>
+              <w:rPr>
+                <w:b w:val="1"/>
+                <w:bCs w:val="1"/>
+                <w:sz w:val="20"/>
+                <w:szCs w:val="20"/>
+              </w:rPr>
+            </w:pPr>
+            <w:r>
+              <w:rPr>
+                <w:rtl w:val="0"/>
+              </w:rPr>
+            </w:r>
+            <w:r>
               <w:t xml:space="preserve">{/mod_certificado_rnc_au_au}</w:t>
-            </w:r>
-          </w:p>
-        </w:tc>
-        <w:tc>
-          <w:tcPr/>
-          <w:p>
-            <w:pPr>
-              <w:widowControl w:val="0"/>
-              <w:jc w:val="both"/>
-              <w:rPr>
-                <w:b w:val="1"/>
-                <w:bCs w:val="1"/>
-                <w:sz w:val="20"/>
-                <w:szCs w:val="20"/>
-              </w:rPr>
-            </w:pPr>
-            <w:r>
-              <w:rPr>
-                <w:rtl w:val="0"/>
-              </w:rPr>
-            </w:r>
-          </w:p>
-        </w:tc>
-        <w:tc>
-          <w:tcPr/>
-          <w:p>
-            <w:pPr>
-              <w:widowControl w:val="0"/>
-              <w:jc w:val="both"/>
-              <w:rPr>
-                <w:b w:val="1"/>
-                <w:bCs w:val="1"/>
-                <w:sz w:val="20"/>
-                <w:szCs w:val="20"/>
-              </w:rPr>
-            </w:pPr>
-            <w:r>
-              <w:rPr>
-                <w:rtl w:val="0"/>
-              </w:rPr>
-            </w:r>
-          </w:p>
-        </w:tc>
-        <w:tc>
-          <w:tcPr/>
-          <w:p>
-            <w:pPr>
-              <w:widowControl w:val="0"/>
-              <w:jc w:val="both"/>
-              <w:rPr>
-                <w:b w:val="1"/>
-                <w:bCs w:val="1"/>
-                <w:sz w:val="20"/>
-                <w:szCs w:val="20"/>
-              </w:rPr>
-            </w:pPr>
-            <w:r>
-              <w:rPr>
-                <w:rtl w:val="0"/>
-              </w:rPr>
             </w:r>
           </w:p>
         </w:tc>
@@ -1068,67 +1083,70 @@
                 <w:szCs w:val="20"/>
                 <w:rtl w:val="0"/>
               </w:rPr>
+              <w:t xml:space="preserve"/>
+            </w:r>
+          </w:p>
+        </w:tc>
+        <w:tc>
+          <w:tcPr/>
+          <w:p>
+            <w:pPr>
+              <w:widowControl w:val="0"/>
+              <w:jc w:val="both"/>
+              <w:rPr>
+                <w:b w:val="1"/>
+                <w:bCs w:val="1"/>
+                <w:sz w:val="20"/>
+                <w:szCs w:val="20"/>
+              </w:rPr>
+            </w:pPr>
+            <w:r>
+              <w:rPr>
+                <w:rtl w:val="0"/>
+              </w:rPr>
+            </w:r>
+          </w:p>
+        </w:tc>
+        <w:tc>
+          <w:tcPr/>
+          <w:p>
+            <w:pPr>
+              <w:widowControl w:val="0"/>
+              <w:jc w:val="both"/>
+              <w:rPr>
+                <w:b w:val="1"/>
+                <w:bCs w:val="1"/>
+                <w:sz w:val="20"/>
+                <w:szCs w:val="20"/>
+              </w:rPr>
+            </w:pPr>
+            <w:r>
+              <w:rPr>
+                <w:rtl w:val="0"/>
+              </w:rPr>
+            </w:r>
+          </w:p>
+        </w:tc>
+        <w:tc>
+          <w:tcPr/>
+          <w:p>
+            <w:pPr>
+              <w:widowControl w:val="0"/>
+              <w:jc w:val="both"/>
+              <w:rPr>
+                <w:b w:val="1"/>
+                <w:bCs w:val="1"/>
+                <w:sz w:val="20"/>
+                <w:szCs w:val="20"/>
+              </w:rPr>
+            </w:pPr>
+            <w:r>
+              <w:rPr>
+                <w:rtl w:val="0"/>
+              </w:rPr>
+            </w:r>
+            <w:r>
               <w:t xml:space="preserve">{/mod_solvencia_laboral_au_au}</w:t>
-            </w:r>
-          </w:p>
-        </w:tc>
-        <w:tc>
-          <w:tcPr/>
-          <w:p>
-            <w:pPr>
-              <w:widowControl w:val="0"/>
-              <w:jc w:val="both"/>
-              <w:rPr>
-                <w:b w:val="1"/>
-                <w:bCs w:val="1"/>
-                <w:sz w:val="20"/>
-                <w:szCs w:val="20"/>
-              </w:rPr>
-            </w:pPr>
-            <w:r>
-              <w:rPr>
-                <w:rtl w:val="0"/>
-              </w:rPr>
-            </w:r>
-          </w:p>
-        </w:tc>
-        <w:tc>
-          <w:tcPr/>
-          <w:p>
-            <w:pPr>
-              <w:widowControl w:val="0"/>
-              <w:jc w:val="both"/>
-              <w:rPr>
-                <w:b w:val="1"/>
-                <w:bCs w:val="1"/>
-                <w:sz w:val="20"/>
-                <w:szCs w:val="20"/>
-              </w:rPr>
-            </w:pPr>
-            <w:r>
-              <w:rPr>
-                <w:rtl w:val="0"/>
-              </w:rPr>
-            </w:r>
-          </w:p>
-        </w:tc>
-        <w:tc>
-          <w:tcPr/>
-          <w:p>
-            <w:pPr>
-              <w:widowControl w:val="0"/>
-              <w:jc w:val="both"/>
-              <w:rPr>
-                <w:b w:val="1"/>
-                <w:bCs w:val="1"/>
-                <w:sz w:val="20"/>
-                <w:szCs w:val="20"/>
-              </w:rPr>
-            </w:pPr>
-            <w:r>
-              <w:rPr>
-                <w:rtl w:val="0"/>
-              </w:rPr>
             </w:r>
           </w:p>
         </w:tc>
@@ -1173,67 +1191,70 @@
                 <w:szCs w:val="20"/>
                 <w:rtl w:val="0"/>
               </w:rPr>
+              <w:t xml:space="preserve"/>
+            </w:r>
+          </w:p>
+        </w:tc>
+        <w:tc>
+          <w:tcPr/>
+          <w:p>
+            <w:pPr>
+              <w:widowControl w:val="0"/>
+              <w:jc w:val="both"/>
+              <w:rPr>
+                <w:b w:val="1"/>
+                <w:bCs w:val="1"/>
+                <w:sz w:val="20"/>
+                <w:szCs w:val="20"/>
+              </w:rPr>
+            </w:pPr>
+            <w:r>
+              <w:rPr>
+                <w:rtl w:val="0"/>
+              </w:rPr>
+            </w:r>
+          </w:p>
+        </w:tc>
+        <w:tc>
+          <w:tcPr/>
+          <w:p>
+            <w:pPr>
+              <w:widowControl w:val="0"/>
+              <w:jc w:val="both"/>
+              <w:rPr>
+                <w:b w:val="1"/>
+                <w:bCs w:val="1"/>
+                <w:sz w:val="20"/>
+                <w:szCs w:val="20"/>
+              </w:rPr>
+            </w:pPr>
+            <w:r>
+              <w:rPr>
+                <w:rtl w:val="0"/>
+              </w:rPr>
+            </w:r>
+          </w:p>
+        </w:tc>
+        <w:tc>
+          <w:tcPr/>
+          <w:p>
+            <w:pPr>
+              <w:widowControl w:val="0"/>
+              <w:jc w:val="both"/>
+              <w:rPr>
+                <w:b w:val="1"/>
+                <w:bCs w:val="1"/>
+                <w:sz w:val="20"/>
+                <w:szCs w:val="20"/>
+              </w:rPr>
+            </w:pPr>
+            <w:r>
+              <w:rPr>
+                <w:rtl w:val="0"/>
+              </w:rPr>
+            </w:r>
+            <w:r>
               <w:t xml:space="preserve">{/mod_declaracion_socios_no_inhabilitados_au_au}</w:t>
-            </w:r>
-          </w:p>
-        </w:tc>
-        <w:tc>
-          <w:tcPr/>
-          <w:p>
-            <w:pPr>
-              <w:widowControl w:val="0"/>
-              <w:jc w:val="both"/>
-              <w:rPr>
-                <w:b w:val="1"/>
-                <w:bCs w:val="1"/>
-                <w:sz w:val="20"/>
-                <w:szCs w:val="20"/>
-              </w:rPr>
-            </w:pPr>
-            <w:r>
-              <w:rPr>
-                <w:rtl w:val="0"/>
-              </w:rPr>
-            </w:r>
-          </w:p>
-        </w:tc>
-        <w:tc>
-          <w:tcPr/>
-          <w:p>
-            <w:pPr>
-              <w:widowControl w:val="0"/>
-              <w:jc w:val="both"/>
-              <w:rPr>
-                <w:b w:val="1"/>
-                <w:bCs w:val="1"/>
-                <w:sz w:val="20"/>
-                <w:szCs w:val="20"/>
-              </w:rPr>
-            </w:pPr>
-            <w:r>
-              <w:rPr>
-                <w:rtl w:val="0"/>
-              </w:rPr>
-            </w:r>
-          </w:p>
-        </w:tc>
-        <w:tc>
-          <w:tcPr/>
-          <w:p>
-            <w:pPr>
-              <w:widowControl w:val="0"/>
-              <w:jc w:val="both"/>
-              <w:rPr>
-                <w:b w:val="1"/>
-                <w:bCs w:val="1"/>
-                <w:sz w:val="20"/>
-                <w:szCs w:val="20"/>
-              </w:rPr>
-            </w:pPr>
-            <w:r>
-              <w:rPr>
-                <w:rtl w:val="0"/>
-              </w:rPr>
             </w:r>
           </w:p>
         </w:tc>
@@ -1279,67 +1300,70 @@
                 <w:szCs w:val="20"/>
                 <w:rtl w:val="0"/>
               </w:rPr>
+              <w:t xml:space="preserve"/>
+            </w:r>
+          </w:p>
+        </w:tc>
+        <w:tc>
+          <w:tcPr/>
+          <w:p>
+            <w:pPr>
+              <w:widowControl w:val="0"/>
+              <w:jc w:val="both"/>
+              <w:rPr>
+                <w:b w:val="1"/>
+                <w:bCs w:val="1"/>
+                <w:sz w:val="20"/>
+                <w:szCs w:val="20"/>
+              </w:rPr>
+            </w:pPr>
+            <w:r>
+              <w:rPr>
+                <w:rtl w:val="0"/>
+              </w:rPr>
+            </w:r>
+          </w:p>
+        </w:tc>
+        <w:tc>
+          <w:tcPr/>
+          <w:p>
+            <w:pPr>
+              <w:widowControl w:val="0"/>
+              <w:jc w:val="both"/>
+              <w:rPr>
+                <w:b w:val="1"/>
+                <w:bCs w:val="1"/>
+                <w:sz w:val="20"/>
+                <w:szCs w:val="20"/>
+              </w:rPr>
+            </w:pPr>
+            <w:r>
+              <w:rPr>
+                <w:rtl w:val="0"/>
+              </w:rPr>
+            </w:r>
+          </w:p>
+        </w:tc>
+        <w:tc>
+          <w:tcPr/>
+          <w:p>
+            <w:pPr>
+              <w:widowControl w:val="0"/>
+              <w:jc w:val="both"/>
+              <w:rPr>
+                <w:b w:val="1"/>
+                <w:bCs w:val="1"/>
+                <w:sz w:val="20"/>
+                <w:szCs w:val="20"/>
+              </w:rPr>
+            </w:pPr>
+            <w:r>
+              <w:rPr>
+                <w:rtl w:val="0"/>
+              </w:rPr>
+            </w:r>
+            <w:r>
               <w:t xml:space="preserve">{/mod_declaracion_no_deudas_ente_au_au}</w:t>
-            </w:r>
-          </w:p>
-        </w:tc>
-        <w:tc>
-          <w:tcPr/>
-          <w:p>
-            <w:pPr>
-              <w:widowControl w:val="0"/>
-              <w:jc w:val="both"/>
-              <w:rPr>
-                <w:b w:val="1"/>
-                <w:bCs w:val="1"/>
-                <w:sz w:val="20"/>
-                <w:szCs w:val="20"/>
-              </w:rPr>
-            </w:pPr>
-            <w:r>
-              <w:rPr>
-                <w:rtl w:val="0"/>
-              </w:rPr>
-            </w:r>
-          </w:p>
-        </w:tc>
-        <w:tc>
-          <w:tcPr/>
-          <w:p>
-            <w:pPr>
-              <w:widowControl w:val="0"/>
-              <w:jc w:val="both"/>
-              <w:rPr>
-                <w:b w:val="1"/>
-                <w:bCs w:val="1"/>
-                <w:sz w:val="20"/>
-                <w:szCs w:val="20"/>
-              </w:rPr>
-            </w:pPr>
-            <w:r>
-              <w:rPr>
-                <w:rtl w:val="0"/>
-              </w:rPr>
-            </w:r>
-          </w:p>
-        </w:tc>
-        <w:tc>
-          <w:tcPr/>
-          <w:p>
-            <w:pPr>
-              <w:widowControl w:val="0"/>
-              <w:jc w:val="both"/>
-              <w:rPr>
-                <w:b w:val="1"/>
-                <w:bCs w:val="1"/>
-                <w:sz w:val="20"/>
-                <w:szCs w:val="20"/>
-              </w:rPr>
-            </w:pPr>
-            <w:r>
-              <w:rPr>
-                <w:rtl w:val="0"/>
-              </w:rPr>
             </w:r>
           </w:p>
         </w:tc>
@@ -1384,67 +1408,70 @@
                 <w:szCs w:val="20"/>
                 <w:rtl w:val="0"/>
               </w:rPr>
+              <w:t xml:space="preserve"/>
+            </w:r>
+          </w:p>
+        </w:tc>
+        <w:tc>
+          <w:tcPr/>
+          <w:p>
+            <w:pPr>
+              <w:widowControl w:val="0"/>
+              <w:jc w:val="both"/>
+              <w:rPr>
+                <w:b w:val="1"/>
+                <w:bCs w:val="1"/>
+                <w:sz w:val="20"/>
+                <w:szCs w:val="20"/>
+              </w:rPr>
+            </w:pPr>
+            <w:r>
+              <w:rPr>
+                <w:rtl w:val="0"/>
+              </w:rPr>
+            </w:r>
+          </w:p>
+        </w:tc>
+        <w:tc>
+          <w:tcPr/>
+          <w:p>
+            <w:pPr>
+              <w:widowControl w:val="0"/>
+              <w:jc w:val="both"/>
+              <w:rPr>
+                <w:b w:val="1"/>
+                <w:bCs w:val="1"/>
+                <w:sz w:val="20"/>
+                <w:szCs w:val="20"/>
+              </w:rPr>
+            </w:pPr>
+            <w:r>
+              <w:rPr>
+                <w:rtl w:val="0"/>
+              </w:rPr>
+            </w:r>
+          </w:p>
+        </w:tc>
+        <w:tc>
+          <w:tcPr/>
+          <w:p>
+            <w:pPr>
+              <w:widowControl w:val="0"/>
+              <w:jc w:val="both"/>
+              <w:rPr>
+                <w:b w:val="1"/>
+                <w:bCs w:val="1"/>
+                <w:sz w:val="20"/>
+                <w:szCs w:val="20"/>
+              </w:rPr>
+            </w:pPr>
+            <w:r>
+              <w:rPr>
+                <w:rtl w:val="0"/>
+              </w:rPr>
+            </w:r>
+            <w:r>
               <w:t xml:space="preserve">{/mod_declaracion_no_impedimentos_lcp_au_au}</w:t>
-            </w:r>
-          </w:p>
-        </w:tc>
-        <w:tc>
-          <w:tcPr/>
-          <w:p>
-            <w:pPr>
-              <w:widowControl w:val="0"/>
-              <w:jc w:val="both"/>
-              <w:rPr>
-                <w:b w:val="1"/>
-                <w:bCs w:val="1"/>
-                <w:sz w:val="20"/>
-                <w:szCs w:val="20"/>
-              </w:rPr>
-            </w:pPr>
-            <w:r>
-              <w:rPr>
-                <w:rtl w:val="0"/>
-              </w:rPr>
-            </w:r>
-          </w:p>
-        </w:tc>
-        <w:tc>
-          <w:tcPr/>
-          <w:p>
-            <w:pPr>
-              <w:widowControl w:val="0"/>
-              <w:jc w:val="both"/>
-              <w:rPr>
-                <w:b w:val="1"/>
-                <w:bCs w:val="1"/>
-                <w:sz w:val="20"/>
-                <w:szCs w:val="20"/>
-              </w:rPr>
-            </w:pPr>
-            <w:r>
-              <w:rPr>
-                <w:rtl w:val="0"/>
-              </w:rPr>
-            </w:r>
-          </w:p>
-        </w:tc>
-        <w:tc>
-          <w:tcPr/>
-          <w:p>
-            <w:pPr>
-              <w:widowControl w:val="0"/>
-              <w:jc w:val="both"/>
-              <w:rPr>
-                <w:b w:val="1"/>
-                <w:bCs w:val="1"/>
-                <w:sz w:val="20"/>
-                <w:szCs w:val="20"/>
-              </w:rPr>
-            </w:pPr>
-            <w:r>
-              <w:rPr>
-                <w:rtl w:val="0"/>
-              </w:rPr>
             </w:r>
           </w:p>
         </w:tc>
@@ -1501,67 +1528,70 @@
                 <w:szCs w:val="20"/>
                 <w:rtl w:val="0"/>
               </w:rPr>
+              <w:t xml:space="preserve"/>
+            </w:r>
+          </w:p>
+        </w:tc>
+        <w:tc>
+          <w:tcPr/>
+          <w:p>
+            <w:pPr>
+              <w:widowControl w:val="0"/>
+              <w:jc w:val="both"/>
+              <w:rPr>
+                <w:b w:val="1"/>
+                <w:bCs w:val="1"/>
+                <w:sz w:val="20"/>
+                <w:szCs w:val="20"/>
+              </w:rPr>
+            </w:pPr>
+            <w:r>
+              <w:rPr>
+                <w:rtl w:val="0"/>
+              </w:rPr>
+            </w:r>
+          </w:p>
+        </w:tc>
+        <w:tc>
+          <w:tcPr/>
+          <w:p>
+            <w:pPr>
+              <w:widowControl w:val="0"/>
+              <w:jc w:val="both"/>
+              <w:rPr>
+                <w:b w:val="1"/>
+                <w:bCs w:val="1"/>
+                <w:sz w:val="20"/>
+                <w:szCs w:val="20"/>
+              </w:rPr>
+            </w:pPr>
+            <w:r>
+              <w:rPr>
+                <w:rtl w:val="0"/>
+              </w:rPr>
+            </w:r>
+          </w:p>
+        </w:tc>
+        <w:tc>
+          <w:tcPr/>
+          <w:p>
+            <w:pPr>
+              <w:widowControl w:val="0"/>
+              <w:jc w:val="both"/>
+              <w:rPr>
+                <w:b w:val="1"/>
+                <w:bCs w:val="1"/>
+                <w:sz w:val="20"/>
+                <w:szCs w:val="20"/>
+              </w:rPr>
+            </w:pPr>
+            <w:r>
+              <w:rPr>
+                <w:rtl w:val="0"/>
+              </w:rPr>
+            </w:r>
+            <w:r>
               <w:t xml:space="preserve">{/mod_declaracion_conocimiento_lugar_au_au}</w:t>
-            </w:r>
-          </w:p>
-        </w:tc>
-        <w:tc>
-          <w:tcPr/>
-          <w:p>
-            <w:pPr>
-              <w:widowControl w:val="0"/>
-              <w:jc w:val="both"/>
-              <w:rPr>
-                <w:b w:val="1"/>
-                <w:bCs w:val="1"/>
-                <w:sz w:val="20"/>
-                <w:szCs w:val="20"/>
-              </w:rPr>
-            </w:pPr>
-            <w:r>
-              <w:rPr>
-                <w:rtl w:val="0"/>
-              </w:rPr>
-            </w:r>
-          </w:p>
-        </w:tc>
-        <w:tc>
-          <w:tcPr/>
-          <w:p>
-            <w:pPr>
-              <w:widowControl w:val="0"/>
-              <w:jc w:val="both"/>
-              <w:rPr>
-                <w:b w:val="1"/>
-                <w:bCs w:val="1"/>
-                <w:sz w:val="20"/>
-                <w:szCs w:val="20"/>
-              </w:rPr>
-            </w:pPr>
-            <w:r>
-              <w:rPr>
-                <w:rtl w:val="0"/>
-              </w:rPr>
-            </w:r>
-          </w:p>
-        </w:tc>
-        <w:tc>
-          <w:tcPr/>
-          <w:p>
-            <w:pPr>
-              <w:widowControl w:val="0"/>
-              <w:jc w:val="both"/>
-              <w:rPr>
-                <w:b w:val="1"/>
-                <w:bCs w:val="1"/>
-                <w:sz w:val="20"/>
-                <w:szCs w:val="20"/>
-              </w:rPr>
-            </w:pPr>
-            <w:r>
-              <w:rPr>
-                <w:rtl w:val="0"/>
-              </w:rPr>
             </w:r>
           </w:p>
         </w:tc>
@@ -1606,67 +1636,70 @@
                 <w:szCs w:val="20"/>
                 <w:rtl w:val="0"/>
               </w:rPr>
+              <w:t xml:space="preserve"/>
+            </w:r>
+          </w:p>
+        </w:tc>
+        <w:tc>
+          <w:tcPr/>
+          <w:p>
+            <w:pPr>
+              <w:widowControl w:val="0"/>
+              <w:jc w:val="both"/>
+              <w:rPr>
+                <w:b w:val="1"/>
+                <w:bCs w:val="1"/>
+                <w:sz w:val="20"/>
+                <w:szCs w:val="20"/>
+              </w:rPr>
+            </w:pPr>
+            <w:r>
+              <w:rPr>
+                <w:rtl w:val="0"/>
+              </w:rPr>
+            </w:r>
+          </w:p>
+        </w:tc>
+        <w:tc>
+          <w:tcPr/>
+          <w:p>
+            <w:pPr>
+              <w:widowControl w:val="0"/>
+              <w:jc w:val="both"/>
+              <w:rPr>
+                <w:b w:val="1"/>
+                <w:bCs w:val="1"/>
+                <w:sz w:val="20"/>
+                <w:szCs w:val="20"/>
+              </w:rPr>
+            </w:pPr>
+            <w:r>
+              <w:rPr>
+                <w:rtl w:val="0"/>
+              </w:rPr>
+            </w:r>
+          </w:p>
+        </w:tc>
+        <w:tc>
+          <w:tcPr/>
+          <w:p>
+            <w:pPr>
+              <w:widowControl w:val="0"/>
+              <w:jc w:val="both"/>
+              <w:rPr>
+                <w:b w:val="1"/>
+                <w:bCs w:val="1"/>
+                <w:sz w:val="20"/>
+                <w:szCs w:val="20"/>
+              </w:rPr>
+            </w:pPr>
+            <w:r>
+              <w:rPr>
+                <w:rtl w:val="0"/>
+              </w:rPr>
+            </w:r>
+            <w:r>
               <w:t xml:space="preserve">{/mod_declaracion_info_financiera_au_au}</w:t>
-            </w:r>
-          </w:p>
-        </w:tc>
-        <w:tc>
-          <w:tcPr/>
-          <w:p>
-            <w:pPr>
-              <w:widowControl w:val="0"/>
-              <w:jc w:val="both"/>
-              <w:rPr>
-                <w:b w:val="1"/>
-                <w:bCs w:val="1"/>
-                <w:sz w:val="20"/>
-                <w:szCs w:val="20"/>
-              </w:rPr>
-            </w:pPr>
-            <w:r>
-              <w:rPr>
-                <w:rtl w:val="0"/>
-              </w:rPr>
-            </w:r>
-          </w:p>
-        </w:tc>
-        <w:tc>
-          <w:tcPr/>
-          <w:p>
-            <w:pPr>
-              <w:widowControl w:val="0"/>
-              <w:jc w:val="both"/>
-              <w:rPr>
-                <w:b w:val="1"/>
-                <w:bCs w:val="1"/>
-                <w:sz w:val="20"/>
-                <w:szCs w:val="20"/>
-              </w:rPr>
-            </w:pPr>
-            <w:r>
-              <w:rPr>
-                <w:rtl w:val="0"/>
-              </w:rPr>
-            </w:r>
-          </w:p>
-        </w:tc>
-        <w:tc>
-          <w:tcPr/>
-          <w:p>
-            <w:pPr>
-              <w:widowControl w:val="0"/>
-              <w:jc w:val="both"/>
-              <w:rPr>
-                <w:b w:val="1"/>
-                <w:bCs w:val="1"/>
-                <w:sz w:val="20"/>
-                <w:szCs w:val="20"/>
-              </w:rPr>
-            </w:pPr>
-            <w:r>
-              <w:rPr>
-                <w:rtl w:val="0"/>
-              </w:rPr>
             </w:r>
           </w:p>
         </w:tc>
@@ -1723,67 +1756,70 @@
                 <w:szCs w:val="20"/>
                 <w:rtl w:val="0"/>
               </w:rPr>
+              <w:t xml:space="preserve"/>
+            </w:r>
+          </w:p>
+        </w:tc>
+        <w:tc>
+          <w:tcPr/>
+          <w:p>
+            <w:pPr>
+              <w:widowControl w:val="0"/>
+              <w:jc w:val="both"/>
+              <w:rPr>
+                <w:b w:val="1"/>
+                <w:bCs w:val="1"/>
+                <w:sz w:val="20"/>
+                <w:szCs w:val="20"/>
+              </w:rPr>
+            </w:pPr>
+            <w:r>
+              <w:rPr>
+                <w:rtl w:val="0"/>
+              </w:rPr>
+            </w:r>
+          </w:p>
+        </w:tc>
+        <w:tc>
+          <w:tcPr/>
+          <w:p>
+            <w:pPr>
+              <w:widowControl w:val="0"/>
+              <w:jc w:val="both"/>
+              <w:rPr>
+                <w:b w:val="1"/>
+                <w:bCs w:val="1"/>
+                <w:sz w:val="20"/>
+                <w:szCs w:val="20"/>
+              </w:rPr>
+            </w:pPr>
+            <w:r>
+              <w:rPr>
+                <w:rtl w:val="0"/>
+              </w:rPr>
+            </w:r>
+          </w:p>
+        </w:tc>
+        <w:tc>
+          <w:tcPr/>
+          <w:p>
+            <w:pPr>
+              <w:widowControl w:val="0"/>
+              <w:jc w:val="both"/>
+              <w:rPr>
+                <w:b w:val="1"/>
+                <w:bCs w:val="1"/>
+                <w:sz w:val="20"/>
+                <w:szCs w:val="20"/>
+              </w:rPr>
+            </w:pPr>
+            <w:r>
+              <w:rPr>
+                <w:rtl w:val="0"/>
+              </w:rPr>
+            </w:r>
+            <w:r>
               <w:t xml:space="preserve">{/mod_evaluacion_desempeno_au_au}</w:t>
-            </w:r>
-          </w:p>
-        </w:tc>
-        <w:tc>
-          <w:tcPr/>
-          <w:p>
-            <w:pPr>
-              <w:widowControl w:val="0"/>
-              <w:jc w:val="both"/>
-              <w:rPr>
-                <w:b w:val="1"/>
-                <w:bCs w:val="1"/>
-                <w:sz w:val="20"/>
-                <w:szCs w:val="20"/>
-              </w:rPr>
-            </w:pPr>
-            <w:r>
-              <w:rPr>
-                <w:rtl w:val="0"/>
-              </w:rPr>
-            </w:r>
-          </w:p>
-        </w:tc>
-        <w:tc>
-          <w:tcPr/>
-          <w:p>
-            <w:pPr>
-              <w:widowControl w:val="0"/>
-              <w:jc w:val="both"/>
-              <w:rPr>
-                <w:b w:val="1"/>
-                <w:bCs w:val="1"/>
-                <w:sz w:val="20"/>
-                <w:szCs w:val="20"/>
-              </w:rPr>
-            </w:pPr>
-            <w:r>
-              <w:rPr>
-                <w:rtl w:val="0"/>
-              </w:rPr>
-            </w:r>
-          </w:p>
-        </w:tc>
-        <w:tc>
-          <w:tcPr/>
-          <w:p>
-            <w:pPr>
-              <w:widowControl w:val="0"/>
-              <w:jc w:val="both"/>
-              <w:rPr>
-                <w:b w:val="1"/>
-                <w:bCs w:val="1"/>
-                <w:sz w:val="20"/>
-                <w:szCs w:val="20"/>
-              </w:rPr>
-            </w:pPr>
-            <w:r>
-              <w:rPr>
-                <w:rtl w:val="0"/>
-              </w:rPr>
             </w:r>
           </w:p>
         </w:tc>
@@ -1830,67 +1866,70 @@
                 <w:szCs w:val="20"/>
                 <w:rtl w:val="0"/>
               </w:rPr>
+              <w:t xml:space="preserve"/>
+            </w:r>
+          </w:p>
+        </w:tc>
+        <w:tc>
+          <w:tcPr/>
+          <w:p>
+            <w:pPr>
+              <w:widowControl w:val="0"/>
+              <w:jc w:val="both"/>
+              <w:rPr>
+                <w:b w:val="1"/>
+                <w:bCs w:val="1"/>
+                <w:sz w:val="20"/>
+                <w:szCs w:val="20"/>
+              </w:rPr>
+            </w:pPr>
+            <w:r>
+              <w:rPr>
+                <w:rtl w:val="0"/>
+              </w:rPr>
+            </w:r>
+          </w:p>
+        </w:tc>
+        <w:tc>
+          <w:tcPr/>
+          <w:p>
+            <w:pPr>
+              <w:widowControl w:val="0"/>
+              <w:jc w:val="both"/>
+              <w:rPr>
+                <w:b w:val="1"/>
+                <w:bCs w:val="1"/>
+                <w:sz w:val="20"/>
+                <w:szCs w:val="20"/>
+              </w:rPr>
+            </w:pPr>
+            <w:r>
+              <w:rPr>
+                <w:rtl w:val="0"/>
+              </w:rPr>
+            </w:r>
+          </w:p>
+        </w:tc>
+        <w:tc>
+          <w:tcPr/>
+          <w:p>
+            <w:pPr>
+              <w:widowControl w:val="0"/>
+              <w:jc w:val="both"/>
+              <w:rPr>
+                <w:b w:val="1"/>
+                <w:bCs w:val="1"/>
+                <w:sz w:val="20"/>
+                <w:szCs w:val="20"/>
+              </w:rPr>
+            </w:pPr>
+            <w:r>
+              <w:rPr>
+                <w:rtl w:val="0"/>
+              </w:rPr>
+            </w:r>
+            <w:r>
               <w:t xml:space="preserve">{/desc_otro_recaudo_sobre1_au_au}</w:t>
-            </w:r>
-          </w:p>
-        </w:tc>
-        <w:tc>
-          <w:tcPr/>
-          <w:p>
-            <w:pPr>
-              <w:widowControl w:val="0"/>
-              <w:jc w:val="both"/>
-              <w:rPr>
-                <w:b w:val="1"/>
-                <w:bCs w:val="1"/>
-                <w:sz w:val="20"/>
-                <w:szCs w:val="20"/>
-              </w:rPr>
-            </w:pPr>
-            <w:r>
-              <w:rPr>
-                <w:rtl w:val="0"/>
-              </w:rPr>
-            </w:r>
-          </w:p>
-        </w:tc>
-        <w:tc>
-          <w:tcPr/>
-          <w:p>
-            <w:pPr>
-              <w:widowControl w:val="0"/>
-              <w:jc w:val="both"/>
-              <w:rPr>
-                <w:b w:val="1"/>
-                <w:bCs w:val="1"/>
-                <w:sz w:val="20"/>
-                <w:szCs w:val="20"/>
-              </w:rPr>
-            </w:pPr>
-            <w:r>
-              <w:rPr>
-                <w:rtl w:val="0"/>
-              </w:rPr>
-            </w:r>
-          </w:p>
-        </w:tc>
-        <w:tc>
-          <w:tcPr/>
-          <w:p>
-            <w:pPr>
-              <w:widowControl w:val="0"/>
-              <w:jc w:val="both"/>
-              <w:rPr>
-                <w:b w:val="1"/>
-                <w:bCs w:val="1"/>
-                <w:sz w:val="20"/>
-                <w:szCs w:val="20"/>
-              </w:rPr>
-            </w:pPr>
-            <w:r>
-              <w:rPr>
-                <w:rtl w:val="0"/>
-              </w:rPr>
             </w:r>
           </w:p>
         </w:tc>
@@ -3079,7 +3118,7 @@
                 <w:szCs w:val="20"/>
                 <w:rtl w:val="0"/>
               </w:rPr>
-              <w:t xml:space="preserve">Observaciones{#oferta_tecnico_economica_au_au}</w:t>
+              <w:t xml:space="preserve">Observaciones</w:t>
             </w:r>
           </w:p>
         </w:tc>
@@ -3094,6 +3133,9 @@
           <w:tcPr/>
           <w:p>
             <w:pPr>
+              <w:r>
+                <w:t xml:space="preserve">{#oferta_tecnico_economica_au_au}</w:t>
+              </w:r>
               <w:jc w:val="both"/>
               <w:rPr>
                 <w:sz w:val="20"/>
@@ -3116,72 +3158,75 @@
                 <w:szCs w:val="20"/>
                 <w:rtl w:val="0"/>
               </w:rPr>
-              <w:t xml:space="preserve"> Oferta técnico-económica.{/oferta_tecnico_economica_au_au}</w:t>
-            </w:r>
-            <w:r>
-              <w:rPr>
-                <w:rtl w:val="0"/>
-              </w:rPr>
-            </w:r>
-          </w:p>
-        </w:tc>
-        <w:tc>
-          <w:tcPr/>
-          <w:p>
-            <w:pPr>
-              <w:widowControl w:val="0"/>
-              <w:jc w:val="both"/>
-              <w:rPr>
-                <w:b w:val="1"/>
-                <w:bCs w:val="1"/>
-                <w:sz w:val="20"/>
-                <w:szCs w:val="20"/>
-              </w:rPr>
-            </w:pPr>
-            <w:r>
-              <w:rPr>
-                <w:rtl w:val="0"/>
-              </w:rPr>
-            </w:r>
-          </w:p>
-        </w:tc>
-        <w:tc>
-          <w:tcPr/>
-          <w:p>
-            <w:pPr>
-              <w:widowControl w:val="0"/>
-              <w:jc w:val="both"/>
-              <w:rPr>
-                <w:b w:val="1"/>
-                <w:bCs w:val="1"/>
-                <w:sz w:val="20"/>
-                <w:szCs w:val="20"/>
-              </w:rPr>
-            </w:pPr>
-            <w:r>
-              <w:rPr>
-                <w:rtl w:val="0"/>
-              </w:rPr>
-            </w:r>
-          </w:p>
-        </w:tc>
-        <w:tc>
-          <w:tcPr/>
-          <w:p>
-            <w:pPr>
-              <w:widowControl w:val="0"/>
-              <w:jc w:val="both"/>
-              <w:rPr>
-                <w:b w:val="1"/>
-                <w:bCs w:val="1"/>
-                <w:sz w:val="20"/>
-                <w:szCs w:val="20"/>
-              </w:rPr>
-            </w:pPr>
-            <w:r>
-              <w:rPr>
-                <w:rtl w:val="0"/>
-              </w:rPr>
+              <w:t xml:space="preserve"> Oferta técnico-económica.</w:t>
+            </w:r>
+            <w:r>
+              <w:rPr>
+                <w:rtl w:val="0"/>
+              </w:rPr>
+            </w:r>
+          </w:p>
+        </w:tc>
+        <w:tc>
+          <w:tcPr/>
+          <w:p>
+            <w:pPr>
+              <w:widowControl w:val="0"/>
+              <w:jc w:val="both"/>
+              <w:rPr>
+                <w:b w:val="1"/>
+                <w:bCs w:val="1"/>
+                <w:sz w:val="20"/>
+                <w:szCs w:val="20"/>
+              </w:rPr>
+            </w:pPr>
+            <w:r>
+              <w:rPr>
+                <w:rtl w:val="0"/>
+              </w:rPr>
+            </w:r>
+          </w:p>
+        </w:tc>
+        <w:tc>
+          <w:tcPr/>
+          <w:p>
+            <w:pPr>
+              <w:widowControl w:val="0"/>
+              <w:jc w:val="both"/>
+              <w:rPr>
+                <w:b w:val="1"/>
+                <w:bCs w:val="1"/>
+                <w:sz w:val="20"/>
+                <w:szCs w:val="20"/>
+              </w:rPr>
+            </w:pPr>
+            <w:r>
+              <w:rPr>
+                <w:rtl w:val="0"/>
+              </w:rPr>
+            </w:r>
+          </w:p>
+        </w:tc>
+        <w:tc>
+          <w:tcPr/>
+          <w:p>
+            <w:pPr>
+              <w:widowControl w:val="0"/>
+              <w:jc w:val="both"/>
+              <w:rPr>
+                <w:b w:val="1"/>
+                <w:bCs w:val="1"/>
+                <w:sz w:val="20"/>
+                <w:szCs w:val="20"/>
+              </w:rPr>
+            </w:pPr>
+            <w:r>
+              <w:rPr>
+                <w:rtl w:val="0"/>
+              </w:rPr>
+            </w:r>
+            <w:r>
+              <w:t xml:space="preserve">{/oferta_tecnico_economica_au_au}</w:t>
             </w:r>
           </w:p>
         </w:tc>
@@ -3228,72 +3273,75 @@
                 <w:szCs w:val="20"/>
                 <w:rtl w:val="0"/>
               </w:rPr>
+              <w:t xml:space="preserve"/>
+            </w:r>
+            <w:r>
+              <w:rPr>
+                <w:rtl w:val="0"/>
+              </w:rPr>
+            </w:r>
+          </w:p>
+        </w:tc>
+        <w:tc>
+          <w:tcPr/>
+          <w:p>
+            <w:pPr>
+              <w:widowControl w:val="0"/>
+              <w:jc w:val="both"/>
+              <w:rPr>
+                <w:b w:val="1"/>
+                <w:bCs w:val="1"/>
+                <w:sz w:val="20"/>
+                <w:szCs w:val="20"/>
+              </w:rPr>
+            </w:pPr>
+            <w:r>
+              <w:rPr>
+                <w:rtl w:val="0"/>
+              </w:rPr>
+            </w:r>
+          </w:p>
+        </w:tc>
+        <w:tc>
+          <w:tcPr/>
+          <w:p>
+            <w:pPr>
+              <w:widowControl w:val="0"/>
+              <w:jc w:val="both"/>
+              <w:rPr>
+                <w:b w:val="1"/>
+                <w:bCs w:val="1"/>
+                <w:sz w:val="20"/>
+                <w:szCs w:val="20"/>
+              </w:rPr>
+            </w:pPr>
+            <w:r>
+              <w:rPr>
+                <w:rtl w:val="0"/>
+              </w:rPr>
+            </w:r>
+          </w:p>
+        </w:tc>
+        <w:tc>
+          <w:tcPr/>
+          <w:p>
+            <w:pPr>
+              <w:widowControl w:val="0"/>
+              <w:jc w:val="both"/>
+              <w:rPr>
+                <w:b w:val="1"/>
+                <w:bCs w:val="1"/>
+                <w:sz w:val="20"/>
+                <w:szCs w:val="20"/>
+              </w:rPr>
+            </w:pPr>
+            <w:r>
+              <w:rPr>
+                <w:rtl w:val="0"/>
+              </w:rPr>
+            </w:r>
+            <w:r>
               <w:t xml:space="preserve">{/mod_carta_oferta_au_au}</w:t>
-            </w:r>
-            <w:r>
-              <w:rPr>
-                <w:rtl w:val="0"/>
-              </w:rPr>
-            </w:r>
-          </w:p>
-        </w:tc>
-        <w:tc>
-          <w:tcPr/>
-          <w:p>
-            <w:pPr>
-              <w:widowControl w:val="0"/>
-              <w:jc w:val="both"/>
-              <w:rPr>
-                <w:b w:val="1"/>
-                <w:bCs w:val="1"/>
-                <w:sz w:val="20"/>
-                <w:szCs w:val="20"/>
-              </w:rPr>
-            </w:pPr>
-            <w:r>
-              <w:rPr>
-                <w:rtl w:val="0"/>
-              </w:rPr>
-            </w:r>
-          </w:p>
-        </w:tc>
-        <w:tc>
-          <w:tcPr/>
-          <w:p>
-            <w:pPr>
-              <w:widowControl w:val="0"/>
-              <w:jc w:val="both"/>
-              <w:rPr>
-                <w:b w:val="1"/>
-                <w:bCs w:val="1"/>
-                <w:sz w:val="20"/>
-                <w:szCs w:val="20"/>
-              </w:rPr>
-            </w:pPr>
-            <w:r>
-              <w:rPr>
-                <w:rtl w:val="0"/>
-              </w:rPr>
-            </w:r>
-          </w:p>
-        </w:tc>
-        <w:tc>
-          <w:tcPr/>
-          <w:p>
-            <w:pPr>
-              <w:widowControl w:val="0"/>
-              <w:jc w:val="both"/>
-              <w:rPr>
-                <w:b w:val="1"/>
-                <w:bCs w:val="1"/>
-                <w:sz w:val="20"/>
-                <w:szCs w:val="20"/>
-              </w:rPr>
-            </w:pPr>
-            <w:r>
-              <w:rPr>
-                <w:rtl w:val="0"/>
-              </w:rPr>
             </w:r>
           </w:p>
         </w:tc>
@@ -3337,67 +3385,70 @@
                 <w:szCs w:val="20"/>
                 <w:rtl w:val="0"/>
               </w:rPr>
+              <w:t xml:space="preserve"/>
+            </w:r>
+          </w:p>
+        </w:tc>
+        <w:tc>
+          <w:tcPr/>
+          <w:p>
+            <w:pPr>
+              <w:widowControl w:val="0"/>
+              <w:jc w:val="both"/>
+              <w:rPr>
+                <w:b w:val="1"/>
+                <w:bCs w:val="1"/>
+                <w:sz w:val="20"/>
+                <w:szCs w:val="20"/>
+              </w:rPr>
+            </w:pPr>
+            <w:r>
+              <w:rPr>
+                <w:rtl w:val="0"/>
+              </w:rPr>
+            </w:r>
+          </w:p>
+        </w:tc>
+        <w:tc>
+          <w:tcPr/>
+          <w:p>
+            <w:pPr>
+              <w:widowControl w:val="0"/>
+              <w:jc w:val="both"/>
+              <w:rPr>
+                <w:b w:val="1"/>
+                <w:bCs w:val="1"/>
+                <w:sz w:val="20"/>
+                <w:szCs w:val="20"/>
+              </w:rPr>
+            </w:pPr>
+            <w:r>
+              <w:rPr>
+                <w:rtl w:val="0"/>
+              </w:rPr>
+            </w:r>
+          </w:p>
+        </w:tc>
+        <w:tc>
+          <w:tcPr/>
+          <w:p>
+            <w:pPr>
+              <w:widowControl w:val="0"/>
+              <w:jc w:val="both"/>
+              <w:rPr>
+                <w:b w:val="1"/>
+                <w:bCs w:val="1"/>
+                <w:sz w:val="20"/>
+                <w:szCs w:val="20"/>
+              </w:rPr>
+            </w:pPr>
+            <w:r>
+              <w:rPr>
+                <w:rtl w:val="0"/>
+              </w:rPr>
+            </w:r>
+            <w:r>
               <w:t xml:space="preserve">{/mod_declaracion_capacidad_financiera_au_au}</w:t>
-            </w:r>
-          </w:p>
-        </w:tc>
-        <w:tc>
-          <w:tcPr/>
-          <w:p>
-            <w:pPr>
-              <w:widowControl w:val="0"/>
-              <w:jc w:val="both"/>
-              <w:rPr>
-                <w:b w:val="1"/>
-                <w:bCs w:val="1"/>
-                <w:sz w:val="20"/>
-                <w:szCs w:val="20"/>
-              </w:rPr>
-            </w:pPr>
-            <w:r>
-              <w:rPr>
-                <w:rtl w:val="0"/>
-              </w:rPr>
-            </w:r>
-          </w:p>
-        </w:tc>
-        <w:tc>
-          <w:tcPr/>
-          <w:p>
-            <w:pPr>
-              <w:widowControl w:val="0"/>
-              <w:jc w:val="both"/>
-              <w:rPr>
-                <w:b w:val="1"/>
-                <w:bCs w:val="1"/>
-                <w:sz w:val="20"/>
-                <w:szCs w:val="20"/>
-              </w:rPr>
-            </w:pPr>
-            <w:r>
-              <w:rPr>
-                <w:rtl w:val="0"/>
-              </w:rPr>
-            </w:r>
-          </w:p>
-        </w:tc>
-        <w:tc>
-          <w:tcPr/>
-          <w:p>
-            <w:pPr>
-              <w:widowControl w:val="0"/>
-              <w:jc w:val="both"/>
-              <w:rPr>
-                <w:b w:val="1"/>
-                <w:bCs w:val="1"/>
-                <w:sz w:val="20"/>
-                <w:szCs w:val="20"/>
-              </w:rPr>
-            </w:pPr>
-            <w:r>
-              <w:rPr>
-                <w:rtl w:val="0"/>
-              </w:rPr>
             </w:r>
           </w:p>
         </w:tc>
@@ -3441,67 +3492,70 @@
                 <w:szCs w:val="20"/>
                 <w:rtl w:val="0"/>
               </w:rPr>
+              <w:t xml:space="preserve"/>
+            </w:r>
+          </w:p>
+        </w:tc>
+        <w:tc>
+          <w:tcPr/>
+          <w:p>
+            <w:pPr>
+              <w:widowControl w:val="0"/>
+              <w:jc w:val="both"/>
+              <w:rPr>
+                <w:b w:val="1"/>
+                <w:bCs w:val="1"/>
+                <w:sz w:val="20"/>
+                <w:szCs w:val="20"/>
+              </w:rPr>
+            </w:pPr>
+            <w:r>
+              <w:rPr>
+                <w:rtl w:val="0"/>
+              </w:rPr>
+            </w:r>
+          </w:p>
+        </w:tc>
+        <w:tc>
+          <w:tcPr/>
+          <w:p>
+            <w:pPr>
+              <w:widowControl w:val="0"/>
+              <w:jc w:val="both"/>
+              <w:rPr>
+                <w:b w:val="1"/>
+                <w:bCs w:val="1"/>
+                <w:sz w:val="20"/>
+                <w:szCs w:val="20"/>
+              </w:rPr>
+            </w:pPr>
+            <w:r>
+              <w:rPr>
+                <w:rtl w:val="0"/>
+              </w:rPr>
+            </w:r>
+          </w:p>
+        </w:tc>
+        <w:tc>
+          <w:tcPr/>
+          <w:p>
+            <w:pPr>
+              <w:widowControl w:val="0"/>
+              <w:jc w:val="both"/>
+              <w:rPr>
+                <w:b w:val="1"/>
+                <w:bCs w:val="1"/>
+                <w:sz w:val="20"/>
+                <w:szCs w:val="20"/>
+              </w:rPr>
+            </w:pPr>
+            <w:r>
+              <w:rPr>
+                <w:rtl w:val="0"/>
+              </w:rPr>
+            </w:r>
+            <w:r>
               <w:t xml:space="preserve">{/mod_declaracion_compromiso_resp_social_au_au}</w:t>
-            </w:r>
-          </w:p>
-        </w:tc>
-        <w:tc>
-          <w:tcPr/>
-          <w:p>
-            <w:pPr>
-              <w:widowControl w:val="0"/>
-              <w:jc w:val="both"/>
-              <w:rPr>
-                <w:b w:val="1"/>
-                <w:bCs w:val="1"/>
-                <w:sz w:val="20"/>
-                <w:szCs w:val="20"/>
-              </w:rPr>
-            </w:pPr>
-            <w:r>
-              <w:rPr>
-                <w:rtl w:val="0"/>
-              </w:rPr>
-            </w:r>
-          </w:p>
-        </w:tc>
-        <w:tc>
-          <w:tcPr/>
-          <w:p>
-            <w:pPr>
-              <w:widowControl w:val="0"/>
-              <w:jc w:val="both"/>
-              <w:rPr>
-                <w:b w:val="1"/>
-                <w:bCs w:val="1"/>
-                <w:sz w:val="20"/>
-                <w:szCs w:val="20"/>
-              </w:rPr>
-            </w:pPr>
-            <w:r>
-              <w:rPr>
-                <w:rtl w:val="0"/>
-              </w:rPr>
-            </w:r>
-          </w:p>
-        </w:tc>
-        <w:tc>
-          <w:tcPr/>
-          <w:p>
-            <w:pPr>
-              <w:widowControl w:val="0"/>
-              <w:jc w:val="both"/>
-              <w:rPr>
-                <w:b w:val="1"/>
-                <w:bCs w:val="1"/>
-                <w:sz w:val="20"/>
-                <w:szCs w:val="20"/>
-              </w:rPr>
-            </w:pPr>
-            <w:r>
-              <w:rPr>
-                <w:rtl w:val="0"/>
-              </w:rPr>
             </w:r>
           </w:p>
         </w:tc>
@@ -3545,67 +3599,70 @@
                 <w:szCs w:val="20"/>
                 <w:rtl w:val="0"/>
               </w:rPr>
+              <w:t xml:space="preserve"/>
+            </w:r>
+          </w:p>
+        </w:tc>
+        <w:tc>
+          <w:tcPr/>
+          <w:p>
+            <w:pPr>
+              <w:widowControl w:val="0"/>
+              <w:jc w:val="both"/>
+              <w:rPr>
+                <w:b w:val="1"/>
+                <w:bCs w:val="1"/>
+                <w:sz w:val="20"/>
+                <w:szCs w:val="20"/>
+              </w:rPr>
+            </w:pPr>
+            <w:r>
+              <w:rPr>
+                <w:rtl w:val="0"/>
+              </w:rPr>
+            </w:r>
+          </w:p>
+        </w:tc>
+        <w:tc>
+          <w:tcPr/>
+          <w:p>
+            <w:pPr>
+              <w:widowControl w:val="0"/>
+              <w:jc w:val="both"/>
+              <w:rPr>
+                <w:b w:val="1"/>
+                <w:bCs w:val="1"/>
+                <w:sz w:val="20"/>
+                <w:szCs w:val="20"/>
+              </w:rPr>
+            </w:pPr>
+            <w:r>
+              <w:rPr>
+                <w:rtl w:val="0"/>
+              </w:rPr>
+            </w:r>
+          </w:p>
+        </w:tc>
+        <w:tc>
+          <w:tcPr/>
+          <w:p>
+            <w:pPr>
+              <w:widowControl w:val="0"/>
+              <w:jc w:val="both"/>
+              <w:rPr>
+                <w:b w:val="1"/>
+                <w:bCs w:val="1"/>
+                <w:sz w:val="20"/>
+                <w:szCs w:val="20"/>
+              </w:rPr>
+            </w:pPr>
+            <w:r>
+              <w:rPr>
+                <w:rtl w:val="0"/>
+              </w:rPr>
+            </w:r>
+            <w:r>
               <w:t xml:space="preserve">{/mod_garantia_mantenimiento_oferta_au_au}</w:t>
-            </w:r>
-          </w:p>
-        </w:tc>
-        <w:tc>
-          <w:tcPr/>
-          <w:p>
-            <w:pPr>
-              <w:widowControl w:val="0"/>
-              <w:jc w:val="both"/>
-              <w:rPr>
-                <w:b w:val="1"/>
-                <w:bCs w:val="1"/>
-                <w:sz w:val="20"/>
-                <w:szCs w:val="20"/>
-              </w:rPr>
-            </w:pPr>
-            <w:r>
-              <w:rPr>
-                <w:rtl w:val="0"/>
-              </w:rPr>
-            </w:r>
-          </w:p>
-        </w:tc>
-        <w:tc>
-          <w:tcPr/>
-          <w:p>
-            <w:pPr>
-              <w:widowControl w:val="0"/>
-              <w:jc w:val="both"/>
-              <w:rPr>
-                <w:b w:val="1"/>
-                <w:bCs w:val="1"/>
-                <w:sz w:val="20"/>
-                <w:szCs w:val="20"/>
-              </w:rPr>
-            </w:pPr>
-            <w:r>
-              <w:rPr>
-                <w:rtl w:val="0"/>
-              </w:rPr>
-            </w:r>
-          </w:p>
-        </w:tc>
-        <w:tc>
-          <w:tcPr/>
-          <w:p>
-            <w:pPr>
-              <w:widowControl w:val="0"/>
-              <w:jc w:val="both"/>
-              <w:rPr>
-                <w:b w:val="1"/>
-                <w:bCs w:val="1"/>
-                <w:sz w:val="20"/>
-                <w:szCs w:val="20"/>
-              </w:rPr>
-            </w:pPr>
-            <w:r>
-              <w:rPr>
-                <w:rtl w:val="0"/>
-              </w:rPr>
             </w:r>
           </w:p>
         </w:tc>
@@ -3649,67 +3706,70 @@
                 <w:szCs w:val="20"/>
                 <w:rtl w:val="0"/>
               </w:rPr>
+              <w:t xml:space="preserve"/>
+            </w:r>
+          </w:p>
+        </w:tc>
+        <w:tc>
+          <w:tcPr/>
+          <w:p>
+            <w:pPr>
+              <w:widowControl w:val="0"/>
+              <w:jc w:val="both"/>
+              <w:rPr>
+                <w:b w:val="1"/>
+                <w:bCs w:val="1"/>
+                <w:sz w:val="20"/>
+                <w:szCs w:val="20"/>
+              </w:rPr>
+            </w:pPr>
+            <w:r>
+              <w:rPr>
+                <w:rtl w:val="0"/>
+              </w:rPr>
+            </w:r>
+          </w:p>
+        </w:tc>
+        <w:tc>
+          <w:tcPr/>
+          <w:p>
+            <w:pPr>
+              <w:widowControl w:val="0"/>
+              <w:jc w:val="both"/>
+              <w:rPr>
+                <w:b w:val="1"/>
+                <w:bCs w:val="1"/>
+                <w:sz w:val="20"/>
+                <w:szCs w:val="20"/>
+              </w:rPr>
+            </w:pPr>
+            <w:r>
+              <w:rPr>
+                <w:rtl w:val="0"/>
+              </w:rPr>
+            </w:r>
+          </w:p>
+        </w:tc>
+        <w:tc>
+          <w:tcPr/>
+          <w:p>
+            <w:pPr>
+              <w:widowControl w:val="0"/>
+              <w:jc w:val="both"/>
+              <w:rPr>
+                <w:b w:val="1"/>
+                <w:bCs w:val="1"/>
+                <w:sz w:val="20"/>
+                <w:szCs w:val="20"/>
+              </w:rPr>
+            </w:pPr>
+            <w:r>
+              <w:rPr>
+                <w:rtl w:val="0"/>
+              </w:rPr>
+            </w:r>
+            <w:r>
               <w:t xml:space="preserve">{/mod_declaracion_autocalculo_van_au_au}</w:t>
-            </w:r>
-          </w:p>
-        </w:tc>
-        <w:tc>
-          <w:tcPr/>
-          <w:p>
-            <w:pPr>
-              <w:widowControl w:val="0"/>
-              <w:jc w:val="both"/>
-              <w:rPr>
-                <w:b w:val="1"/>
-                <w:bCs w:val="1"/>
-                <w:sz w:val="20"/>
-                <w:szCs w:val="20"/>
-              </w:rPr>
-            </w:pPr>
-            <w:r>
-              <w:rPr>
-                <w:rtl w:val="0"/>
-              </w:rPr>
-            </w:r>
-          </w:p>
-        </w:tc>
-        <w:tc>
-          <w:tcPr/>
-          <w:p>
-            <w:pPr>
-              <w:widowControl w:val="0"/>
-              <w:jc w:val="both"/>
-              <w:rPr>
-                <w:b w:val="1"/>
-                <w:bCs w:val="1"/>
-                <w:sz w:val="20"/>
-                <w:szCs w:val="20"/>
-              </w:rPr>
-            </w:pPr>
-            <w:r>
-              <w:rPr>
-                <w:rtl w:val="0"/>
-              </w:rPr>
-            </w:r>
-          </w:p>
-        </w:tc>
-        <w:tc>
-          <w:tcPr/>
-          <w:p>
-            <w:pPr>
-              <w:widowControl w:val="0"/>
-              <w:jc w:val="both"/>
-              <w:rPr>
-                <w:b w:val="1"/>
-                <w:bCs w:val="1"/>
-                <w:sz w:val="20"/>
-                <w:szCs w:val="20"/>
-              </w:rPr>
-            </w:pPr>
-            <w:r>
-              <w:rPr>
-                <w:rtl w:val="0"/>
-              </w:rPr>
             </w:r>
           </w:p>
         </w:tc>
@@ -3766,67 +3826,70 @@
                 <w:szCs w:val="20"/>
                 <w:rtl w:val="0"/>
               </w:rPr>
+              <w:t xml:space="preserve"/>
+            </w:r>
+          </w:p>
+        </w:tc>
+        <w:tc>
+          <w:tcPr/>
+          <w:p>
+            <w:pPr>
+              <w:widowControl w:val="0"/>
+              <w:jc w:val="both"/>
+              <w:rPr>
+                <w:b w:val="1"/>
+                <w:bCs w:val="1"/>
+                <w:sz w:val="20"/>
+                <w:szCs w:val="20"/>
+              </w:rPr>
+            </w:pPr>
+            <w:r>
+              <w:rPr>
+                <w:rtl w:val="0"/>
+              </w:rPr>
+            </w:r>
+          </w:p>
+        </w:tc>
+        <w:tc>
+          <w:tcPr/>
+          <w:p>
+            <w:pPr>
+              <w:widowControl w:val="0"/>
+              <w:jc w:val="both"/>
+              <w:rPr>
+                <w:b w:val="1"/>
+                <w:bCs w:val="1"/>
+                <w:sz w:val="20"/>
+                <w:szCs w:val="20"/>
+              </w:rPr>
+            </w:pPr>
+            <w:r>
+              <w:rPr>
+                <w:rtl w:val="0"/>
+              </w:rPr>
+            </w:r>
+          </w:p>
+        </w:tc>
+        <w:tc>
+          <w:tcPr/>
+          <w:p>
+            <w:pPr>
+              <w:widowControl w:val="0"/>
+              <w:jc w:val="both"/>
+              <w:rPr>
+                <w:b w:val="1"/>
+                <w:bCs w:val="1"/>
+                <w:sz w:val="20"/>
+                <w:szCs w:val="20"/>
+              </w:rPr>
+            </w:pPr>
+            <w:r>
+              <w:rPr>
+                <w:rtl w:val="0"/>
+              </w:rPr>
+            </w:r>
+            <w:r>
               <w:t xml:space="preserve">{/mod_carta_notificaciones_au_au}</w:t>
-            </w:r>
-          </w:p>
-        </w:tc>
-        <w:tc>
-          <w:tcPr/>
-          <w:p>
-            <w:pPr>
-              <w:widowControl w:val="0"/>
-              <w:jc w:val="both"/>
-              <w:rPr>
-                <w:b w:val="1"/>
-                <w:bCs w:val="1"/>
-                <w:sz w:val="20"/>
-                <w:szCs w:val="20"/>
-              </w:rPr>
-            </w:pPr>
-            <w:r>
-              <w:rPr>
-                <w:rtl w:val="0"/>
-              </w:rPr>
-            </w:r>
-          </w:p>
-        </w:tc>
-        <w:tc>
-          <w:tcPr/>
-          <w:p>
-            <w:pPr>
-              <w:widowControl w:val="0"/>
-              <w:jc w:val="both"/>
-              <w:rPr>
-                <w:b w:val="1"/>
-                <w:bCs w:val="1"/>
-                <w:sz w:val="20"/>
-                <w:szCs w:val="20"/>
-              </w:rPr>
-            </w:pPr>
-            <w:r>
-              <w:rPr>
-                <w:rtl w:val="0"/>
-              </w:rPr>
-            </w:r>
-          </w:p>
-        </w:tc>
-        <w:tc>
-          <w:tcPr/>
-          <w:p>
-            <w:pPr>
-              <w:widowControl w:val="0"/>
-              <w:jc w:val="both"/>
-              <w:rPr>
-                <w:b w:val="1"/>
-                <w:bCs w:val="1"/>
-                <w:sz w:val="20"/>
-                <w:szCs w:val="20"/>
-              </w:rPr>
-            </w:pPr>
-            <w:r>
-              <w:rPr>
-                <w:rtl w:val="0"/>
-              </w:rPr>
             </w:r>
           </w:p>
         </w:tc>
@@ -3883,67 +3946,70 @@
                 <w:szCs w:val="20"/>
                 <w:rtl w:val="0"/>
               </w:rPr>
+              <w:t xml:space="preserve"/>
+            </w:r>
+          </w:p>
+        </w:tc>
+        <w:tc>
+          <w:tcPr/>
+          <w:p>
+            <w:pPr>
+              <w:widowControl w:val="0"/>
+              <w:jc w:val="both"/>
+              <w:rPr>
+                <w:b w:val="1"/>
+                <w:bCs w:val="1"/>
+                <w:sz w:val="20"/>
+                <w:szCs w:val="20"/>
+              </w:rPr>
+            </w:pPr>
+            <w:r>
+              <w:rPr>
+                <w:rtl w:val="0"/>
+              </w:rPr>
+            </w:r>
+          </w:p>
+        </w:tc>
+        <w:tc>
+          <w:tcPr/>
+          <w:p>
+            <w:pPr>
+              <w:widowControl w:val="0"/>
+              <w:jc w:val="both"/>
+              <w:rPr>
+                <w:b w:val="1"/>
+                <w:bCs w:val="1"/>
+                <w:sz w:val="20"/>
+                <w:szCs w:val="20"/>
+              </w:rPr>
+            </w:pPr>
+            <w:r>
+              <w:rPr>
+                <w:rtl w:val="0"/>
+              </w:rPr>
+            </w:r>
+          </w:p>
+        </w:tc>
+        <w:tc>
+          <w:tcPr/>
+          <w:p>
+            <w:pPr>
+              <w:widowControl w:val="0"/>
+              <w:jc w:val="both"/>
+              <w:rPr>
+                <w:b w:val="1"/>
+                <w:bCs w:val="1"/>
+                <w:sz w:val="20"/>
+                <w:szCs w:val="20"/>
+              </w:rPr>
+            </w:pPr>
+            <w:r>
+              <w:rPr>
+                <w:rtl w:val="0"/>
+              </w:rPr>
+            </w:r>
+            <w:r>
               <w:t xml:space="preserve">{/mod_garantia_fiel_cumpl_au_au}</w:t>
-            </w:r>
-          </w:p>
-        </w:tc>
-        <w:tc>
-          <w:tcPr/>
-          <w:p>
-            <w:pPr>
-              <w:widowControl w:val="0"/>
-              <w:jc w:val="both"/>
-              <w:rPr>
-                <w:b w:val="1"/>
-                <w:bCs w:val="1"/>
-                <w:sz w:val="20"/>
-                <w:szCs w:val="20"/>
-              </w:rPr>
-            </w:pPr>
-            <w:r>
-              <w:rPr>
-                <w:rtl w:val="0"/>
-              </w:rPr>
-            </w:r>
-          </w:p>
-        </w:tc>
-        <w:tc>
-          <w:tcPr/>
-          <w:p>
-            <w:pPr>
-              <w:widowControl w:val="0"/>
-              <w:jc w:val="both"/>
-              <w:rPr>
-                <w:b w:val="1"/>
-                <w:bCs w:val="1"/>
-                <w:sz w:val="20"/>
-                <w:szCs w:val="20"/>
-              </w:rPr>
-            </w:pPr>
-            <w:r>
-              <w:rPr>
-                <w:rtl w:val="0"/>
-              </w:rPr>
-            </w:r>
-          </w:p>
-        </w:tc>
-        <w:tc>
-          <w:tcPr/>
-          <w:p>
-            <w:pPr>
-              <w:widowControl w:val="0"/>
-              <w:jc w:val="both"/>
-              <w:rPr>
-                <w:b w:val="1"/>
-                <w:bCs w:val="1"/>
-                <w:sz w:val="20"/>
-                <w:szCs w:val="20"/>
-              </w:rPr>
-            </w:pPr>
-            <w:r>
-              <w:rPr>
-                <w:rtl w:val="0"/>
-              </w:rPr>
             </w:r>
           </w:p>
         </w:tc>
@@ -4000,67 +4066,70 @@
                 <w:szCs w:val="20"/>
                 <w:rtl w:val="0"/>
               </w:rPr>
+              <w:t xml:space="preserve"/>
+            </w:r>
+          </w:p>
+        </w:tc>
+        <w:tc>
+          <w:tcPr/>
+          <w:p>
+            <w:pPr>
+              <w:widowControl w:val="0"/>
+              <w:jc w:val="both"/>
+              <w:rPr>
+                <w:b w:val="1"/>
+                <w:bCs w:val="1"/>
+                <w:sz w:val="20"/>
+                <w:szCs w:val="20"/>
+              </w:rPr>
+            </w:pPr>
+            <w:r>
+              <w:rPr>
+                <w:rtl w:val="0"/>
+              </w:rPr>
+            </w:r>
+          </w:p>
+        </w:tc>
+        <w:tc>
+          <w:tcPr/>
+          <w:p>
+            <w:pPr>
+              <w:widowControl w:val="0"/>
+              <w:jc w:val="both"/>
+              <w:rPr>
+                <w:b w:val="1"/>
+                <w:bCs w:val="1"/>
+                <w:sz w:val="20"/>
+                <w:szCs w:val="20"/>
+              </w:rPr>
+            </w:pPr>
+            <w:r>
+              <w:rPr>
+                <w:rtl w:val="0"/>
+              </w:rPr>
+            </w:r>
+          </w:p>
+        </w:tc>
+        <w:tc>
+          <w:tcPr/>
+          <w:p>
+            <w:pPr>
+              <w:widowControl w:val="0"/>
+              <w:jc w:val="both"/>
+              <w:rPr>
+                <w:b w:val="1"/>
+                <w:bCs w:val="1"/>
+                <w:sz w:val="20"/>
+                <w:szCs w:val="20"/>
+              </w:rPr>
+            </w:pPr>
+            <w:r>
+              <w:rPr>
+                <w:rtl w:val="0"/>
+              </w:rPr>
+            </w:r>
+            <w:r>
               <w:t xml:space="preserve">{/mod_fianza_laboral_au_au}</w:t>
-            </w:r>
-          </w:p>
-        </w:tc>
-        <w:tc>
-          <w:tcPr/>
-          <w:p>
-            <w:pPr>
-              <w:widowControl w:val="0"/>
-              <w:jc w:val="both"/>
-              <w:rPr>
-                <w:b w:val="1"/>
-                <w:bCs w:val="1"/>
-                <w:sz w:val="20"/>
-                <w:szCs w:val="20"/>
-              </w:rPr>
-            </w:pPr>
-            <w:r>
-              <w:rPr>
-                <w:rtl w:val="0"/>
-              </w:rPr>
-            </w:r>
-          </w:p>
-        </w:tc>
-        <w:tc>
-          <w:tcPr/>
-          <w:p>
-            <w:pPr>
-              <w:widowControl w:val="0"/>
-              <w:jc w:val="both"/>
-              <w:rPr>
-                <w:b w:val="1"/>
-                <w:bCs w:val="1"/>
-                <w:sz w:val="20"/>
-                <w:szCs w:val="20"/>
-              </w:rPr>
-            </w:pPr>
-            <w:r>
-              <w:rPr>
-                <w:rtl w:val="0"/>
-              </w:rPr>
-            </w:r>
-          </w:p>
-        </w:tc>
-        <w:tc>
-          <w:tcPr/>
-          <w:p>
-            <w:pPr>
-              <w:widowControl w:val="0"/>
-              <w:jc w:val="both"/>
-              <w:rPr>
-                <w:b w:val="1"/>
-                <w:bCs w:val="1"/>
-                <w:sz w:val="20"/>
-                <w:szCs w:val="20"/>
-              </w:rPr>
-            </w:pPr>
-            <w:r>
-              <w:rPr>
-                <w:rtl w:val="0"/>
-              </w:rPr>
             </w:r>
           </w:p>
         </w:tc>
@@ -4117,67 +4186,70 @@
                 <w:szCs w:val="20"/>
                 <w:rtl w:val="0"/>
               </w:rPr>
-              <w:t xml:space="preserve"> {/desc_otro_recaudo_sobre2_au_au}</w:t>
-            </w:r>
-          </w:p>
-        </w:tc>
-        <w:tc>
-          <w:tcPr/>
-          <w:p>
-            <w:pPr>
-              <w:widowControl w:val="0"/>
-              <w:jc w:val="both"/>
-              <w:rPr>
-                <w:b w:val="1"/>
-                <w:bCs w:val="1"/>
-                <w:sz w:val="20"/>
-                <w:szCs w:val="20"/>
-              </w:rPr>
-            </w:pPr>
-            <w:r>
-              <w:rPr>
-                <w:rtl w:val="0"/>
-              </w:rPr>
-            </w:r>
-          </w:p>
-        </w:tc>
-        <w:tc>
-          <w:tcPr/>
-          <w:p>
-            <w:pPr>
-              <w:widowControl w:val="0"/>
-              <w:jc w:val="both"/>
-              <w:rPr>
-                <w:b w:val="1"/>
-                <w:bCs w:val="1"/>
-                <w:sz w:val="20"/>
-                <w:szCs w:val="20"/>
-              </w:rPr>
-            </w:pPr>
-            <w:r>
-              <w:rPr>
-                <w:rtl w:val="0"/>
-              </w:rPr>
-            </w:r>
-          </w:p>
-        </w:tc>
-        <w:tc>
-          <w:tcPr/>
-          <w:p>
-            <w:pPr>
-              <w:widowControl w:val="0"/>
-              <w:jc w:val="both"/>
-              <w:rPr>
-                <w:b w:val="1"/>
-                <w:bCs w:val="1"/>
-                <w:sz w:val="20"/>
-                <w:szCs w:val="20"/>
-              </w:rPr>
-            </w:pPr>
-            <w:r>
-              <w:rPr>
-                <w:rtl w:val="0"/>
-              </w:rPr>
+              <w:t xml:space="preserve"> </w:t>
+            </w:r>
+          </w:p>
+        </w:tc>
+        <w:tc>
+          <w:tcPr/>
+          <w:p>
+            <w:pPr>
+              <w:widowControl w:val="0"/>
+              <w:jc w:val="both"/>
+              <w:rPr>
+                <w:b w:val="1"/>
+                <w:bCs w:val="1"/>
+                <w:sz w:val="20"/>
+                <w:szCs w:val="20"/>
+              </w:rPr>
+            </w:pPr>
+            <w:r>
+              <w:rPr>
+                <w:rtl w:val="0"/>
+              </w:rPr>
+            </w:r>
+          </w:p>
+        </w:tc>
+        <w:tc>
+          <w:tcPr/>
+          <w:p>
+            <w:pPr>
+              <w:widowControl w:val="0"/>
+              <w:jc w:val="both"/>
+              <w:rPr>
+                <w:b w:val="1"/>
+                <w:bCs w:val="1"/>
+                <w:sz w:val="20"/>
+                <w:szCs w:val="20"/>
+              </w:rPr>
+            </w:pPr>
+            <w:r>
+              <w:rPr>
+                <w:rtl w:val="0"/>
+              </w:rPr>
+            </w:r>
+          </w:p>
+        </w:tc>
+        <w:tc>
+          <w:tcPr/>
+          <w:p>
+            <w:pPr>
+              <w:widowControl w:val="0"/>
+              <w:jc w:val="both"/>
+              <w:rPr>
+                <w:b w:val="1"/>
+                <w:bCs w:val="1"/>
+                <w:sz w:val="20"/>
+                <w:szCs w:val="20"/>
+              </w:rPr>
+            </w:pPr>
+            <w:r>
+              <w:rPr>
+                <w:rtl w:val="0"/>
+              </w:rPr>
+            </w:r>
+            <w:r>
+              <w:t xml:space="preserve">{/desc_otro_recaudo_sobre2_au_au}</w:t>
             </w:r>
           </w:p>
         </w:tc>

</xml_diff>